<commit_message>
Tell the pre-install guide to open a root shell first.
lvs on the new VM fails for azureuser with Permission denied on the LVM lock file.
</commit_message>
<xml_diff>
--- a/docs/customer/TNMS-9.1-RHEL8-pre-install.docx
+++ b/docs/customer/TNMS-9.1-RHEL8-pre-install.docx
@@ -32,6 +32,41 @@
       </w:hyperlink>
       <w:r>
         <w:t xml:space="preserve">. The VM matches the resources of the server that already has TNMS 9.1 installed. This guide builds the disk layout. The install guide installs Oracle and TNMS.</w:t>
+      </w:r>
+    </w:p>
+    <w:p>
+      <w:pPr>
+        <w:pStyle w:val="BodyText"/>
+      </w:pPr>
+      <w:r>
+        <w:t xml:space="preserve">Run the commands as root. Section 1 opens that shell from the</w:t>
+      </w:r>
+      <w:r>
+        <w:t xml:space="preserve"> </w:t>
+      </w:r>
+      <w:r>
+        <w:rPr>
+          <w:rStyle w:val="VerbatimChar"/>
+        </w:rPr>
+        <w:t xml:space="preserve">azureuser</w:t>
+      </w:r>
+      <w:r>
+        <w:t xml:space="preserve"> </w:t>
+      </w:r>
+      <w:r>
+        <w:t xml:space="preserve">login. The prompt ends with</w:t>
+      </w:r>
+      <w:r>
+        <w:t xml:space="preserve"> </w:t>
+      </w:r>
+      <w:r>
+        <w:rPr>
+          <w:rStyle w:val="VerbatimChar"/>
+        </w:rPr>
+        <w:t xml:space="preserve">#</w:t>
+      </w:r>
+      <w:r>
+        <w:t xml:space="preserve">.</w:t>
       </w:r>
     </w:p>
     <w:p>
@@ -1291,6 +1326,222 @@
         <w:t xml:space="preserve">1. Confirm the VM</w:t>
       </w:r>
       <w:bookmarkEnd w:id="25"/>
+    </w:p>
+    <w:p>
+      <w:pPr>
+        <w:pStyle w:val="FirstParagraph"/>
+      </w:pPr>
+      <w:r>
+        <w:t xml:space="preserve">Log in as</w:t>
+      </w:r>
+      <w:r>
+        <w:t xml:space="preserve"> </w:t>
+      </w:r>
+      <w:r>
+        <w:rPr>
+          <w:rStyle w:val="VerbatimChar"/>
+        </w:rPr>
+        <w:t xml:space="preserve">azureuser</w:t>
+      </w:r>
+      <w:r>
+        <w:t xml:space="preserve">, then open a root shell. Every command after this one runs in that shell.</w:t>
+      </w:r>
+    </w:p>
+    <w:p>
+      <w:pPr>
+        <w:pStyle w:val="SourceCode"/>
+        <w:spacing w:before="120" w:after="120" w:line="276" w:lineRule="auto"/>
+      </w:pPr>
+      <w:r>
+        <w:rPr>
+          <w:rStyle w:val="FunctionTok"/>
+        </w:rPr>
+        <w:t xml:space="preserve">sudo</w:t>
+      </w:r>
+      <w:r>
+        <w:rPr>
+          <w:rStyle w:val="NormalTok"/>
+        </w:rPr>
+        <w:t xml:space="preserve"> -i</w:t>
+      </w:r>
+    </w:p>
+    <w:p>
+      <w:pPr>
+        <w:pStyle w:val="FirstParagraph"/>
+      </w:pPr>
+      <w:r>
+        <w:rPr>
+          <w:b/>
+        </w:rPr>
+        <w:t xml:space="preserve">Expected output:</w:t>
+      </w:r>
+    </w:p>
+    <w:p>
+      <w:pPr>
+        <w:pStyle w:val="BodyText"/>
+      </w:pPr>
+      <w:r>
+        <w:t xml:space="preserve">The prompt changes from</w:t>
+      </w:r>
+      <w:r>
+        <w:t xml:space="preserve"> </w:t>
+      </w:r>
+      <w:r>
+        <w:rPr>
+          <w:rStyle w:val="VerbatimChar"/>
+        </w:rPr>
+        <w:t xml:space="preserve">[azureuser@TNMSDEMO ~]$</w:t>
+      </w:r>
+      <w:r>
+        <w:t xml:space="preserve"> </w:t>
+      </w:r>
+      <w:r>
+        <w:t xml:space="preserve">to</w:t>
+      </w:r>
+      <w:r>
+        <w:t xml:space="preserve"> </w:t>
+      </w:r>
+      <w:r>
+        <w:rPr>
+          <w:rStyle w:val="VerbatimChar"/>
+        </w:rPr>
+        <w:t xml:space="preserve">[root@TNMSDEMO ~]#</w:t>
+      </w:r>
+      <w:r>
+        <w:t xml:space="preserve">. The hostname is the VM name.</w:t>
+      </w:r>
+    </w:p>
+    <w:p>
+      <w:pPr>
+        <w:pStyle w:val="BodyText"/>
+      </w:pPr>
+      <w:r>
+        <w:rPr>
+          <w:b/>
+        </w:rPr>
+        <w:t xml:space="preserve">Confirm by running:</w:t>
+      </w:r>
+    </w:p>
+    <w:p>
+      <w:pPr>
+        <w:pStyle w:val="SourceCode"/>
+        <w:spacing w:before="120" w:after="120" w:line="276" w:lineRule="auto"/>
+      </w:pPr>
+      <w:r>
+        <w:rPr>
+          <w:rStyle w:val="FunctionTok"/>
+        </w:rPr>
+        <w:t xml:space="preserve">id</w:t>
+      </w:r>
+    </w:p>
+    <w:p>
+      <w:pPr>
+        <w:pStyle w:val="FirstParagraph"/>
+      </w:pPr>
+      <w:r>
+        <w:rPr>
+          <w:b/>
+        </w:rPr>
+        <w:t xml:space="preserve">Expected output:</w:t>
+      </w:r>
+    </w:p>
+    <w:p>
+      <w:pPr>
+        <w:pStyle w:val="SourceCode"/>
+        <w:spacing w:before="120" w:after="120" w:line="276" w:lineRule="auto"/>
+      </w:pPr>
+      <w:r>
+        <w:rPr>
+          <w:rStyle w:val="VerbatimChar"/>
+        </w:rPr>
+        <w:t xml:space="preserve">uid=0(root) gid=0(root) groups=0(root)</w:t>
+      </w:r>
+    </w:p>
+    <w:p>
+      <w:pPr>
+        <w:pStyle w:val="FirstParagraph"/>
+      </w:pPr>
+      <w:r>
+        <w:rPr>
+          <w:rStyle w:val="VerbatimChar"/>
+        </w:rPr>
+        <w:t xml:space="preserve">lvs</w:t>
+      </w:r>
+      <w:r>
+        <w:t xml:space="preserve"> </w:t>
+      </w:r>
+      <w:r>
+        <w:t xml:space="preserve">in the</w:t>
+      </w:r>
+      <w:r>
+        <w:t xml:space="preserve"> </w:t>
+      </w:r>
+      <w:r>
+        <w:rPr>
+          <w:rStyle w:val="VerbatimChar"/>
+        </w:rPr>
+        <w:t xml:space="preserve">azureuser</w:t>
+      </w:r>
+      <w:r>
+        <w:t xml:space="preserve"> </w:t>
+      </w:r>
+      <w:r>
+        <w:t xml:space="preserve">shell stops with</w:t>
+      </w:r>
+      <w:r>
+        <w:t xml:space="preserve"> </w:t>
+      </w:r>
+      <w:r>
+        <w:rPr>
+          <w:rStyle w:val="VerbatimChar"/>
+        </w:rPr>
+        <w:t xml:space="preserve">Permission denied</w:t>
+      </w:r>
+      <w:r>
+        <w:t xml:space="preserve"> </w:t>
+      </w:r>
+      <w:r>
+        <w:t xml:space="preserve">on</w:t>
+      </w:r>
+      <w:r>
+        <w:t xml:space="preserve"> </w:t>
+      </w:r>
+      <w:r>
+        <w:rPr>
+          <w:rStyle w:val="VerbatimChar"/>
+        </w:rPr>
+        <w:t xml:space="preserve">/run/lock/lvm/P_global:aux</w:t>
+      </w:r>
+      <w:r>
+        <w:t xml:space="preserve">. That message means the shell is still</w:t>
+      </w:r>
+      <w:r>
+        <w:t xml:space="preserve"> </w:t>
+      </w:r>
+      <w:r>
+        <w:rPr>
+          <w:rStyle w:val="VerbatimChar"/>
+        </w:rPr>
+        <w:t xml:space="preserve">azureuser</w:t>
+      </w:r>
+      <w:r>
+        <w:t xml:space="preserve">. Run</w:t>
+      </w:r>
+      <w:r>
+        <w:t xml:space="preserve"> </w:t>
+      </w:r>
+      <w:r>
+        <w:rPr>
+          <w:rStyle w:val="VerbatimChar"/>
+        </w:rPr>
+        <w:t xml:space="preserve">sudo -i</w:t>
+      </w:r>
+      <w:r>
+        <w:t xml:space="preserve"> </w:t>
+      </w:r>
+      <w:r>
+        <w:t xml:space="preserve">again.</w:t>
+      </w:r>
     </w:p>
     <w:p>
       <w:pPr>
@@ -4620,7 +4871,7 @@
     </w:lvl>
   </w:abstractNum>
   <w:abstractNum w:abstractNumId="990">
-    <w:nsid w:val="3114cbbc"/>
+    <w:nsid w:val="f62c34ca"/>
     <w:multiLevelType w:val="multilevel"/>
     <w:lvl w:ilvl="0">
       <w:numFmt w:val="bullet"/>

</xml_diff>

<commit_message>
Stop the swap file until /opt is the 1 TB volume.
An 18 GB dd while /opt is still a directory on the root filesystem fills the 8 GB root volume and stops near 7.9 GiB. The pre-install guide now requires findmnt to show datavg-optlv before that write, and it requires a non-empty filesystem UUID before appending fstab.
</commit_message>
<xml_diff>
--- a/docs/customer/TNMS-9.1-RHEL8-pre-install.docx
+++ b/docs/customer/TNMS-9.1-RHEL8-pre-install.docx
@@ -3381,13 +3381,14 @@
     </w:p>
     <w:p>
       <w:pPr>
-        <w:pStyle w:val="Heading2"/>
-      </w:pPr>
-      <w:bookmarkStart w:id="28" w:name="directories-data-binds-and-swap"/>
-      <w:r>
-        <w:t xml:space="preserve">4. Directories, data binds, and swap</w:t>
-      </w:r>
-      <w:bookmarkEnd w:id="28"/>
+        <w:pStyle w:val="BodyText"/>
+      </w:pPr>
+      <w:r>
+        <w:rPr>
+          <w:b/>
+        </w:rPr>
+        <w:t xml:space="preserve">Confirm by running:</w:t>
+      </w:r>
     </w:p>
     <w:p>
       <w:pPr>
@@ -3396,75 +3397,15 @@
       </w:pPr>
       <w:r>
         <w:rPr>
-          <w:rStyle w:val="FunctionTok"/>
-        </w:rPr>
-        <w:t xml:space="preserve">install</w:t>
-      </w:r>
-      <w:r>
-        <w:rPr>
-          <w:rStyle w:val="NormalTok"/>
-        </w:rPr>
-        <w:t xml:space="preserve"> -d -m 755 /opt/oracle /opt/nokia /opt/tnms-data /nokia /oradata</w:t>
-      </w:r>
-      <w:r>
-        <w:br w:type="textWrapping"/>
-      </w:r>
-      <w:r>
-        <w:rPr>
-          <w:rStyle w:val="FunctionTok"/>
-        </w:rPr>
-        <w:t xml:space="preserve">install</w:t>
-      </w:r>
-      <w:r>
-        <w:rPr>
-          <w:rStyle w:val="NormalTok"/>
-        </w:rPr>
-        <w:t xml:space="preserve"> -d -m 755 /opt/oradata/ora1 /opt/oradata/ora2 /opt/oradata/ora3</w:t>
-      </w:r>
-      <w:r>
-        <w:br w:type="textWrapping"/>
-      </w:r>
-      <w:r>
-        <w:rPr>
-          <w:rStyle w:val="FunctionTok"/>
-        </w:rPr>
-        <w:t xml:space="preserve">install</w:t>
-      </w:r>
-      <w:r>
-        <w:rPr>
-          <w:rStyle w:val="NormalTok"/>
-        </w:rPr>
-        <w:t xml:space="preserve"> -d -o root -g root -m 700 /opt/tnms-install /opt/tnms-install/resources</w:t>
-      </w:r>
-      <w:r>
-        <w:br w:type="textWrapping"/>
-      </w:r>
-      <w:r>
-        <w:rPr>
-          <w:rStyle w:val="FunctionTok"/>
-        </w:rPr>
-        <w:t xml:space="preserve">mount</w:t>
-      </w:r>
-      <w:r>
-        <w:rPr>
-          <w:rStyle w:val="NormalTok"/>
-        </w:rPr>
-        <w:t xml:space="preserve"> --bind /opt/tnms-data /nokia</w:t>
-      </w:r>
-      <w:r>
-        <w:br w:type="textWrapping"/>
-      </w:r>
-      <w:r>
-        <w:rPr>
-          <w:rStyle w:val="FunctionTok"/>
-        </w:rPr>
-        <w:t xml:space="preserve">mount</w:t>
-      </w:r>
-      <w:r>
-        <w:rPr>
-          <w:rStyle w:val="NormalTok"/>
-        </w:rPr>
-        <w:t xml:space="preserve"> --bind /opt/oradata /oradata</w:t>
+          <w:rStyle w:val="ExtensionTok"/>
+        </w:rPr>
+        <w:t xml:space="preserve">findmnt</w:t>
+      </w:r>
+      <w:r>
+        <w:rPr>
+          <w:rStyle w:val="NormalTok"/>
+        </w:rPr>
+        <w:t xml:space="preserve"> -n -o SOURCE,SIZE,TARGET /opt</w:t>
       </w:r>
     </w:p>
     <w:p>
@@ -3472,46 +3413,72 @@
         <w:pStyle w:val="FirstParagraph"/>
       </w:pPr>
       <w:r>
-        <w:t xml:space="preserve">Those commands print nothing.</w:t>
-      </w:r>
-      <w:r>
-        <w:t xml:space="preserve"> </w:t>
-      </w:r>
-      <w:r>
-        <w:rPr>
-          <w:rStyle w:val="VerbatimChar"/>
-        </w:rPr>
-        <w:t xml:space="preserve">/opt/tnms-install</w:t>
-      </w:r>
-      <w:r>
-        <w:t xml:space="preserve"> </w:t>
-      </w:r>
-      <w:r>
-        <w:t xml:space="preserve">is mode</w:t>
-      </w:r>
-      <w:r>
-        <w:t xml:space="preserve"> </w:t>
-      </w:r>
-      <w:r>
-        <w:rPr>
-          <w:rStyle w:val="VerbatimChar"/>
-        </w:rPr>
-        <w:t xml:space="preserve">700</w:t>
-      </w:r>
-      <w:r>
-        <w:t xml:space="preserve"> </w:t>
-      </w:r>
-      <w:r>
-        <w:t xml:space="preserve">because it will hold the properties file. The database passwords and the wizard log stay in</w:t>
-      </w:r>
-      <w:r>
-        <w:t xml:space="preserve"> </w:t>
-      </w:r>
-      <w:r>
-        <w:rPr>
-          <w:rStyle w:val="VerbatimChar"/>
-        </w:rPr>
-        <w:t xml:space="preserve">/root</w:t>
+        <w:rPr>
+          <w:b/>
+        </w:rPr>
+        <w:t xml:space="preserve">Expected output:</w:t>
+      </w:r>
+    </w:p>
+    <w:p>
+      <w:pPr>
+        <w:pStyle w:val="BodyText"/>
+      </w:pPr>
+      <w:r>
+        <w:t xml:space="preserve">One line.</w:t>
+      </w:r>
+      <w:r>
+        <w:t xml:space="preserve"> </w:t>
+      </w:r>
+      <w:r>
+        <w:rPr>
+          <w:rStyle w:val="VerbatimChar"/>
+        </w:rPr>
+        <w:t xml:space="preserve">SOURCE</w:t>
+      </w:r>
+      <w:r>
+        <w:t xml:space="preserve"> </w:t>
+      </w:r>
+      <w:r>
+        <w:t xml:space="preserve">is</w:t>
+      </w:r>
+      <w:r>
+        <w:t xml:space="preserve"> </w:t>
+      </w:r>
+      <w:r>
+        <w:rPr>
+          <w:rStyle w:val="VerbatimChar"/>
+        </w:rPr>
+        <w:t xml:space="preserve">/dev/mapper/datavg-optlv</w:t>
+      </w:r>
+      <w:r>
+        <w:t xml:space="preserve"> </w:t>
+      </w:r>
+      <w:r>
+        <w:t xml:space="preserve">and</w:t>
+      </w:r>
+      <w:r>
+        <w:t xml:space="preserve"> </w:t>
+      </w:r>
+      <w:r>
+        <w:rPr>
+          <w:rStyle w:val="VerbatimChar"/>
+        </w:rPr>
+        <w:t xml:space="preserve">SIZE</w:t>
+      </w:r>
+      <w:r>
+        <w:t xml:space="preserve"> </w:t>
+      </w:r>
+      <w:r>
+        <w:t xml:space="preserve">is about</w:t>
+      </w:r>
+      <w:r>
+        <w:t xml:space="preserve"> </w:t>
+      </w:r>
+      <w:r>
+        <w:rPr>
+          <w:rStyle w:val="VerbatimChar"/>
+        </w:rPr>
+        <w:t xml:space="preserve">1T</w:t>
       </w:r>
       <w:r>
         <w:t xml:space="preserve">.</w:t>
@@ -3524,60 +3491,9 @@
       </w:pPr>
       <w:r>
         <w:rPr>
-          <w:rStyle w:val="FunctionTok"/>
-        </w:rPr>
-        <w:t xml:space="preserve">dd</w:t>
-      </w:r>
-      <w:r>
-        <w:rPr>
-          <w:rStyle w:val="NormalTok"/>
-        </w:rPr>
-        <w:t xml:space="preserve"> if=/dev/zero of=/opt/swapfile bs=1G count=18 status=progress</w:t>
-      </w:r>
-      <w:r>
-        <w:br w:type="textWrapping"/>
-      </w:r>
-      <w:r>
-        <w:rPr>
-          <w:rStyle w:val="FunctionTok"/>
-        </w:rPr>
-        <w:t xml:space="preserve">chmod</w:t>
-      </w:r>
-      <w:r>
-        <w:rPr>
-          <w:rStyle w:val="NormalTok"/>
-        </w:rPr>
-        <w:t xml:space="preserve"> 600 /opt/swapfile</w:t>
-      </w:r>
-      <w:r>
-        <w:br w:type="textWrapping"/>
-      </w:r>
-      <w:r>
-        <w:rPr>
-          <w:rStyle w:val="ExtensionTok"/>
-        </w:rPr>
-        <w:t xml:space="preserve">mkswap</w:t>
-      </w:r>
-      <w:r>
-        <w:rPr>
-          <w:rStyle w:val="NormalTok"/>
-        </w:rPr>
-        <w:t xml:space="preserve"> /opt/swapfile</w:t>
-      </w:r>
-      <w:r>
-        <w:br w:type="textWrapping"/>
-      </w:r>
-      <w:r>
-        <w:rPr>
-          <w:rStyle w:val="ExtensionTok"/>
-        </w:rPr>
-        <w:t xml:space="preserve">swapon</w:t>
-      </w:r>
-      <w:r>
-        <w:rPr>
-          <w:rStyle w:val="NormalTok"/>
-        </w:rPr>
-        <w:t xml:space="preserve"> /opt/swapfile</w:t>
+          <w:rStyle w:val="VerbatimChar"/>
+        </w:rPr>
+        <w:t xml:space="preserve">/dev/mapper/datavg-optlv  1T   /opt</w:t>
       </w:r>
     </w:p>
     <w:p>
@@ -3585,60 +3501,75 @@
         <w:pStyle w:val="FirstParagraph"/>
       </w:pPr>
       <w:r>
-        <w:rPr>
-          <w:rStyle w:val="VerbatimChar"/>
-        </w:rPr>
-        <w:t xml:space="preserve">dd</w:t>
-      </w:r>
-      <w:r>
-        <w:t xml:space="preserve"> </w:t>
-      </w:r>
-      <w:r>
-        <w:t xml:space="preserve">finishes when it has written 18 GB.</w:t>
-      </w:r>
-      <w:r>
-        <w:t xml:space="preserve"> </w:t>
-      </w:r>
-      <w:r>
-        <w:rPr>
-          <w:rStyle w:val="VerbatimChar"/>
-        </w:rPr>
-        <w:t xml:space="preserve">chmod</w:t>
-      </w:r>
-      <w:r>
-        <w:t xml:space="preserve"> </w:t>
-      </w:r>
-      <w:r>
-        <w:t xml:space="preserve">prints nothing.</w:t>
-      </w:r>
-    </w:p>
-    <w:p>
-      <w:pPr>
-        <w:pStyle w:val="BodyText"/>
-      </w:pPr>
-      <w:r>
-        <w:rPr>
-          <w:b/>
-        </w:rPr>
-        <w:t xml:space="preserve">Expected output:</w:t>
-      </w:r>
-    </w:p>
-    <w:p>
-      <w:pPr>
-        <w:pStyle w:val="BodyText"/>
-      </w:pPr>
-      <w:r>
-        <w:rPr>
-          <w:rStyle w:val="VerbatimChar"/>
-        </w:rPr>
-        <w:t xml:space="preserve">mkswap</w:t>
-      </w:r>
-      <w:r>
-        <w:t xml:space="preserve"> </w:t>
-      </w:r>
-      <w:r>
-        <w:t xml:space="preserve">includes:</w:t>
-      </w:r>
+        <w:t xml:space="preserve">Empty output means</w:t>
+      </w:r>
+      <w:r>
+        <w:t xml:space="preserve"> </w:t>
+      </w:r>
+      <w:r>
+        <w:rPr>
+          <w:rStyle w:val="VerbatimChar"/>
+        </w:rPr>
+        <w:t xml:space="preserve">/opt</w:t>
+      </w:r>
+      <w:r>
+        <w:t xml:space="preserve"> </w:t>
+      </w:r>
+      <w:r>
+        <w:t xml:space="preserve">is not a mount.</w:t>
+      </w:r>
+      <w:r>
+        <w:t xml:space="preserve"> </w:t>
+      </w:r>
+      <w:r>
+        <w:rPr>
+          <w:rStyle w:val="VerbatimChar"/>
+        </w:rPr>
+        <w:t xml:space="preserve">/opt</w:t>
+      </w:r>
+      <w:r>
+        <w:t xml:space="preserve"> </w:t>
+      </w:r>
+      <w:r>
+        <w:t xml:space="preserve">is still a directory on the 8 GB root filesystem. Stop and repeat the</w:t>
+      </w:r>
+      <w:r>
+        <w:t xml:space="preserve"> </w:t>
+      </w:r>
+      <w:r>
+        <w:rPr>
+          <w:rStyle w:val="VerbatimChar"/>
+        </w:rPr>
+        <w:t xml:space="preserve">mount</w:t>
+      </w:r>
+      <w:r>
+        <w:t xml:space="preserve"> </w:t>
+      </w:r>
+      <w:r>
+        <w:t xml:space="preserve">command. Section 4 writes an 18 GB file under</w:t>
+      </w:r>
+      <w:r>
+        <w:t xml:space="preserve"> </w:t>
+      </w:r>
+      <w:r>
+        <w:rPr>
+          <w:rStyle w:val="VerbatimChar"/>
+        </w:rPr>
+        <w:t xml:space="preserve">/opt</w:t>
+      </w:r>
+      <w:r>
+        <w:t xml:space="preserve">.</w:t>
+      </w:r>
+    </w:p>
+    <w:p>
+      <w:pPr>
+        <w:pStyle w:val="Heading2"/>
+      </w:pPr>
+      <w:bookmarkStart w:id="28" w:name="directories-data-binds-and-swap"/>
+      <w:r>
+        <w:t xml:space="preserve">4. Directories, data binds, and swap</w:t>
+      </w:r>
+      <w:bookmarkEnd w:id="28"/>
     </w:p>
     <w:p>
       <w:pPr>
@@ -3647,9 +3578,75 @@
       </w:pPr>
       <w:r>
         <w:rPr>
-          <w:rStyle w:val="VerbatimChar"/>
-        </w:rPr>
-        <w:t xml:space="preserve">Setting up swapspace version 1, size = 18 GiB</w:t>
+          <w:rStyle w:val="FunctionTok"/>
+        </w:rPr>
+        <w:t xml:space="preserve">install</w:t>
+      </w:r>
+      <w:r>
+        <w:rPr>
+          <w:rStyle w:val="NormalTok"/>
+        </w:rPr>
+        <w:t xml:space="preserve"> -d -m 755 /opt/oracle /opt/nokia /opt/tnms-data /nokia /oradata</w:t>
+      </w:r>
+      <w:r>
+        <w:br w:type="textWrapping"/>
+      </w:r>
+      <w:r>
+        <w:rPr>
+          <w:rStyle w:val="FunctionTok"/>
+        </w:rPr>
+        <w:t xml:space="preserve">install</w:t>
+      </w:r>
+      <w:r>
+        <w:rPr>
+          <w:rStyle w:val="NormalTok"/>
+        </w:rPr>
+        <w:t xml:space="preserve"> -d -m 755 /opt/oradata/ora1 /opt/oradata/ora2 /opt/oradata/ora3</w:t>
+      </w:r>
+      <w:r>
+        <w:br w:type="textWrapping"/>
+      </w:r>
+      <w:r>
+        <w:rPr>
+          <w:rStyle w:val="FunctionTok"/>
+        </w:rPr>
+        <w:t xml:space="preserve">install</w:t>
+      </w:r>
+      <w:r>
+        <w:rPr>
+          <w:rStyle w:val="NormalTok"/>
+        </w:rPr>
+        <w:t xml:space="preserve"> -d -o root -g root -m 700 /opt/tnms-install /opt/tnms-install/resources</w:t>
+      </w:r>
+      <w:r>
+        <w:br w:type="textWrapping"/>
+      </w:r>
+      <w:r>
+        <w:rPr>
+          <w:rStyle w:val="FunctionTok"/>
+        </w:rPr>
+        <w:t xml:space="preserve">mount</w:t>
+      </w:r>
+      <w:r>
+        <w:rPr>
+          <w:rStyle w:val="NormalTok"/>
+        </w:rPr>
+        <w:t xml:space="preserve"> --bind /opt/tnms-data /nokia</w:t>
+      </w:r>
+      <w:r>
+        <w:br w:type="textWrapping"/>
+      </w:r>
+      <w:r>
+        <w:rPr>
+          <w:rStyle w:val="FunctionTok"/>
+        </w:rPr>
+        <w:t xml:space="preserve">mount</w:t>
+      </w:r>
+      <w:r>
+        <w:rPr>
+          <w:rStyle w:val="NormalTok"/>
+        </w:rPr>
+        <w:t xml:space="preserve"> --bind /opt/oradata /oradata</w:t>
       </w:r>
     </w:p>
     <w:p>
@@ -3657,16 +3654,49 @@
         <w:pStyle w:val="FirstParagraph"/>
       </w:pPr>
       <w:r>
-        <w:rPr>
-          <w:rStyle w:val="VerbatimChar"/>
-        </w:rPr>
-        <w:t xml:space="preserve">swapon</w:t>
-      </w:r>
-      <w:r>
-        <w:t xml:space="preserve"> </w:t>
-      </w:r>
-      <w:r>
-        <w:t xml:space="preserve">prints nothing.</w:t>
+        <w:t xml:space="preserve">Those commands print nothing.</w:t>
+      </w:r>
+      <w:r>
+        <w:t xml:space="preserve"> </w:t>
+      </w:r>
+      <w:r>
+        <w:rPr>
+          <w:rStyle w:val="VerbatimChar"/>
+        </w:rPr>
+        <w:t xml:space="preserve">/opt/tnms-install</w:t>
+      </w:r>
+      <w:r>
+        <w:t xml:space="preserve"> </w:t>
+      </w:r>
+      <w:r>
+        <w:t xml:space="preserve">is mode</w:t>
+      </w:r>
+      <w:r>
+        <w:t xml:space="preserve"> </w:t>
+      </w:r>
+      <w:r>
+        <w:rPr>
+          <w:rStyle w:val="VerbatimChar"/>
+        </w:rPr>
+        <w:t xml:space="preserve">700</w:t>
+      </w:r>
+      <w:r>
+        <w:t xml:space="preserve"> </w:t>
+      </w:r>
+      <w:r>
+        <w:t xml:space="preserve">because it will hold the properties file. The database passwords and the wizard log stay in</w:t>
+      </w:r>
+      <w:r>
+        <w:t xml:space="preserve"> </w:t>
+      </w:r>
+      <w:r>
+        <w:rPr>
+          <w:rStyle w:val="VerbatimChar"/>
+        </w:rPr>
+        <w:t xml:space="preserve">/root</w:t>
+      </w:r>
+      <w:r>
+        <w:t xml:space="preserve">.</w:t>
       </w:r>
     </w:p>
     <w:p>
@@ -3674,37 +3704,10 @@
         <w:pStyle w:val="BodyText"/>
       </w:pPr>
       <w:r>
-        <w:t xml:space="preserve">Write</w:t>
-      </w:r>
-      <w:r>
-        <w:t xml:space="preserve"> </w:t>
-      </w:r>
-      <w:r>
-        <w:rPr>
-          <w:rStyle w:val="VerbatimChar"/>
-        </w:rPr>
-        <w:t xml:space="preserve">/etc/fstab</w:t>
-      </w:r>
-      <w:r>
-        <w:t xml:space="preserve"> </w:t>
-      </w:r>
-      <w:r>
-        <w:t xml:space="preserve">with the filesystem UUID.</w:t>
-      </w:r>
-      <w:r>
-        <w:t xml:space="preserve"> </w:t>
-      </w:r>
-      <w:r>
-        <w:rPr>
-          <w:rStyle w:val="VerbatimChar"/>
-        </w:rPr>
-        <w:t xml:space="preserve">nofail</w:t>
-      </w:r>
-      <w:r>
-        <w:t xml:space="preserve"> </w:t>
-      </w:r>
-      <w:r>
-        <w:t xml:space="preserve">lets the VM boot when the data disk is absent. The checks in the next section catch a missing mount before the install.</w:t>
+        <w:rPr>
+          <w:b/>
+        </w:rPr>
+        <w:t xml:space="preserve">Confirm by running:</w:t>
       </w:r>
     </w:p>
     <w:p>
@@ -3714,6 +3717,484 @@
       </w:pPr>
       <w:r>
         <w:rPr>
+          <w:rStyle w:val="ExtensionTok"/>
+        </w:rPr>
+        <w:t xml:space="preserve">findmnt</w:t>
+      </w:r>
+      <w:r>
+        <w:rPr>
+          <w:rStyle w:val="NormalTok"/>
+        </w:rPr>
+        <w:t xml:space="preserve"> -n -o SOURCE,SIZE,TARGET /opt</w:t>
+      </w:r>
+      <w:r>
+        <w:br w:type="textWrapping"/>
+      </w:r>
+      <w:r>
+        <w:rPr>
+          <w:rStyle w:val="FunctionTok"/>
+        </w:rPr>
+        <w:t xml:space="preserve">df</w:t>
+      </w:r>
+      <w:r>
+        <w:rPr>
+          <w:rStyle w:val="NormalTok"/>
+        </w:rPr>
+        <w:t xml:space="preserve"> -h /opt</w:t>
+      </w:r>
+    </w:p>
+    <w:p>
+      <w:pPr>
+        <w:pStyle w:val="FirstParagraph"/>
+      </w:pPr>
+      <w:r>
+        <w:rPr>
+          <w:b/>
+        </w:rPr>
+        <w:t xml:space="preserve">Expected output:</w:t>
+      </w:r>
+    </w:p>
+    <w:p>
+      <w:pPr>
+        <w:pStyle w:val="BodyText"/>
+      </w:pPr>
+      <w:r>
+        <w:rPr>
+          <w:rStyle w:val="VerbatimChar"/>
+        </w:rPr>
+        <w:t xml:space="preserve">findmnt</w:t>
+      </w:r>
+      <w:r>
+        <w:t xml:space="preserve"> </w:t>
+      </w:r>
+      <w:r>
+        <w:t xml:space="preserve">prints one line for</w:t>
+      </w:r>
+      <w:r>
+        <w:t xml:space="preserve"> </w:t>
+      </w:r>
+      <w:r>
+        <w:rPr>
+          <w:rStyle w:val="VerbatimChar"/>
+        </w:rPr>
+        <w:t xml:space="preserve">/dev/mapper/datavg-optlv</w:t>
+      </w:r>
+      <w:r>
+        <w:t xml:space="preserve">. Empty</w:t>
+      </w:r>
+      <w:r>
+        <w:t xml:space="preserve"> </w:t>
+      </w:r>
+      <w:r>
+        <w:rPr>
+          <w:rStyle w:val="VerbatimChar"/>
+        </w:rPr>
+        <w:t xml:space="preserve">findmnt</w:t>
+      </w:r>
+      <w:r>
+        <w:t xml:space="preserve"> </w:t>
+      </w:r>
+      <w:r>
+        <w:t xml:space="preserve">output means</w:t>
+      </w:r>
+      <w:r>
+        <w:t xml:space="preserve"> </w:t>
+      </w:r>
+      <w:r>
+        <w:rPr>
+          <w:rStyle w:val="VerbatimChar"/>
+        </w:rPr>
+        <w:t xml:space="preserve">/opt</w:t>
+      </w:r>
+      <w:r>
+        <w:t xml:space="preserve"> </w:t>
+      </w:r>
+      <w:r>
+        <w:t xml:space="preserve">is not a mount.</w:t>
+      </w:r>
+      <w:r>
+        <w:t xml:space="preserve"> </w:t>
+      </w:r>
+      <w:r>
+        <w:rPr>
+          <w:rStyle w:val="VerbatimChar"/>
+        </w:rPr>
+        <w:t xml:space="preserve">df</w:t>
+      </w:r>
+      <w:r>
+        <w:t xml:space="preserve"> </w:t>
+      </w:r>
+      <w:r>
+        <w:t xml:space="preserve">shows that same device, with</w:t>
+      </w:r>
+      <w:r>
+        <w:t xml:space="preserve"> </w:t>
+      </w:r>
+      <w:r>
+        <w:rPr>
+          <w:rStyle w:val="VerbatimChar"/>
+        </w:rPr>
+        <w:t xml:space="preserve">Avail</w:t>
+      </w:r>
+      <w:r>
+        <w:t xml:space="preserve"> </w:t>
+      </w:r>
+      <w:r>
+        <w:t xml:space="preserve">about</w:t>
+      </w:r>
+      <w:r>
+        <w:t xml:space="preserve"> </w:t>
+      </w:r>
+      <w:r>
+        <w:rPr>
+          <w:rStyle w:val="VerbatimChar"/>
+        </w:rPr>
+        <w:t xml:space="preserve">1T</w:t>
+      </w:r>
+      <w:r>
+        <w:t xml:space="preserve"> </w:t>
+      </w:r>
+      <w:r>
+        <w:t xml:space="preserve">and greater than 20G. Continue to</w:t>
+      </w:r>
+      <w:r>
+        <w:t xml:space="preserve"> </w:t>
+      </w:r>
+      <w:r>
+        <w:rPr>
+          <w:rStyle w:val="VerbatimChar"/>
+        </w:rPr>
+        <w:t xml:space="preserve">dd</w:t>
+      </w:r>
+      <w:r>
+        <w:t xml:space="preserve"> </w:t>
+      </w:r>
+      <w:r>
+        <w:t xml:space="preserve">only when both are true.</w:t>
+      </w:r>
+      <w:r>
+        <w:t xml:space="preserve"> </w:t>
+      </w:r>
+      <w:r>
+        <w:rPr>
+          <w:rStyle w:val="VerbatimChar"/>
+        </w:rPr>
+        <w:t xml:space="preserve">df</w:t>
+      </w:r>
+      <w:r>
+        <w:t xml:space="preserve"> </w:t>
+      </w:r>
+      <w:r>
+        <w:t xml:space="preserve">showing</w:t>
+      </w:r>
+      <w:r>
+        <w:t xml:space="preserve"> </w:t>
+      </w:r>
+      <w:r>
+        <w:rPr>
+          <w:rStyle w:val="VerbatimChar"/>
+        </w:rPr>
+        <w:t xml:space="preserve">rootvg-rootlv</w:t>
+      </w:r>
+      <w:r>
+        <w:t xml:space="preserve"> </w:t>
+      </w:r>
+      <w:r>
+        <w:t xml:space="preserve">and a size of about 8G means</w:t>
+      </w:r>
+      <w:r>
+        <w:t xml:space="preserve"> </w:t>
+      </w:r>
+      <w:r>
+        <w:rPr>
+          <w:rStyle w:val="VerbatimChar"/>
+        </w:rPr>
+        <w:t xml:space="preserve">/opt</w:t>
+      </w:r>
+      <w:r>
+        <w:t xml:space="preserve"> </w:t>
+      </w:r>
+      <w:r>
+        <w:t xml:space="preserve">is still on the root filesystem.</w:t>
+      </w:r>
+      <w:r>
+        <w:t xml:space="preserve"> </w:t>
+      </w:r>
+      <w:r>
+        <w:rPr>
+          <w:rStyle w:val="VerbatimChar"/>
+        </w:rPr>
+        <w:t xml:space="preserve">dd</w:t>
+      </w:r>
+      <w:r>
+        <w:t xml:space="preserve"> </w:t>
+      </w:r>
+      <w:r>
+        <w:t xml:space="preserve">then stops with</w:t>
+      </w:r>
+      <w:r>
+        <w:t xml:space="preserve"> </w:t>
+      </w:r>
+      <w:r>
+        <w:rPr>
+          <w:rStyle w:val="VerbatimChar"/>
+        </w:rPr>
+        <w:t xml:space="preserve">No space left on device</w:t>
+      </w:r>
+      <w:r>
+        <w:t xml:space="preserve"> </w:t>
+      </w:r>
+      <w:r>
+        <w:t xml:space="preserve">after about 7.9 GiB and leaves</w:t>
+      </w:r>
+      <w:r>
+        <w:t xml:space="preserve"> </w:t>
+      </w:r>
+      <w:r>
+        <w:rPr>
+          <w:rStyle w:val="VerbatimChar"/>
+        </w:rPr>
+        <w:t xml:space="preserve">/</w:t>
+      </w:r>
+      <w:r>
+        <w:t xml:space="preserve"> </w:t>
+      </w:r>
+      <w:r>
+        <w:t xml:space="preserve">full.</w:t>
+      </w:r>
+    </w:p>
+    <w:p>
+      <w:pPr>
+        <w:pStyle w:val="SourceCode"/>
+        <w:spacing w:before="120" w:after="120" w:line="276" w:lineRule="auto"/>
+      </w:pPr>
+      <w:r>
+        <w:rPr>
+          <w:rStyle w:val="VerbatimChar"/>
+        </w:rPr>
+        <w:t xml:space="preserve">/dev/mapper/datavg-optlv  1T   /opt</w:t>
+      </w:r>
+      <w:r>
+        <w:br w:type="textWrapping"/>
+      </w:r>
+      <w:r>
+        <w:rPr>
+          <w:rStyle w:val="VerbatimChar"/>
+        </w:rPr>
+        <w:t xml:space="preserve">Filesystem                    Size  Used Avail Use% Mounted on</w:t>
+      </w:r>
+      <w:r>
+        <w:br w:type="textWrapping"/>
+      </w:r>
+      <w:r>
+        <w:rPr>
+          <w:rStyle w:val="VerbatimChar"/>
+        </w:rPr>
+        <w:t xml:space="preserve">/dev/mapper/datavg-optlv      1.0T   10G  1.0T   1% /opt</w:t>
+      </w:r>
+    </w:p>
+    <w:p>
+      <w:pPr>
+        <w:pStyle w:val="FirstParagraph"/>
+      </w:pPr>
+      <w:r>
+        <w:rPr>
+          <w:rStyle w:val="VerbatimChar"/>
+        </w:rPr>
+        <w:t xml:space="preserve">Used</w:t>
+      </w:r>
+      <w:r>
+        <w:t xml:space="preserve"> </w:t>
+      </w:r>
+      <w:r>
+        <w:t xml:space="preserve">follows the disk.</w:t>
+      </w:r>
+      <w:r>
+        <w:t xml:space="preserve"> </w:t>
+      </w:r>
+      <w:r>
+        <w:rPr>
+          <w:rStyle w:val="VerbatimChar"/>
+        </w:rPr>
+        <w:t xml:space="preserve">Avail</w:t>
+      </w:r>
+      <w:r>
+        <w:t xml:space="preserve"> </w:t>
+      </w:r>
+      <w:r>
+        <w:t xml:space="preserve">stays above 20G.</w:t>
+      </w:r>
+    </w:p>
+    <w:p>
+      <w:pPr>
+        <w:pStyle w:val="SourceCode"/>
+        <w:spacing w:before="120" w:after="120" w:line="276" w:lineRule="auto"/>
+      </w:pPr>
+      <w:r>
+        <w:rPr>
+          <w:rStyle w:val="FunctionTok"/>
+        </w:rPr>
+        <w:t xml:space="preserve">dd</w:t>
+      </w:r>
+      <w:r>
+        <w:rPr>
+          <w:rStyle w:val="NormalTok"/>
+        </w:rPr>
+        <w:t xml:space="preserve"> if=/dev/zero of=/opt/swapfile bs=1G count=18 status=progress</w:t>
+      </w:r>
+      <w:r>
+        <w:br w:type="textWrapping"/>
+      </w:r>
+      <w:r>
+        <w:rPr>
+          <w:rStyle w:val="FunctionTok"/>
+        </w:rPr>
+        <w:t xml:space="preserve">chmod</w:t>
+      </w:r>
+      <w:r>
+        <w:rPr>
+          <w:rStyle w:val="NormalTok"/>
+        </w:rPr>
+        <w:t xml:space="preserve"> 600 /opt/swapfile</w:t>
+      </w:r>
+      <w:r>
+        <w:br w:type="textWrapping"/>
+      </w:r>
+      <w:r>
+        <w:rPr>
+          <w:rStyle w:val="ExtensionTok"/>
+        </w:rPr>
+        <w:t xml:space="preserve">mkswap</w:t>
+      </w:r>
+      <w:r>
+        <w:rPr>
+          <w:rStyle w:val="NormalTok"/>
+        </w:rPr>
+        <w:t xml:space="preserve"> /opt/swapfile</w:t>
+      </w:r>
+      <w:r>
+        <w:br w:type="textWrapping"/>
+      </w:r>
+      <w:r>
+        <w:rPr>
+          <w:rStyle w:val="ExtensionTok"/>
+        </w:rPr>
+        <w:t xml:space="preserve">swapon</w:t>
+      </w:r>
+      <w:r>
+        <w:rPr>
+          <w:rStyle w:val="NormalTok"/>
+        </w:rPr>
+        <w:t xml:space="preserve"> /opt/swapfile</w:t>
+      </w:r>
+    </w:p>
+    <w:p>
+      <w:pPr>
+        <w:pStyle w:val="FirstParagraph"/>
+      </w:pPr>
+      <w:r>
+        <w:rPr>
+          <w:rStyle w:val="VerbatimChar"/>
+        </w:rPr>
+        <w:t xml:space="preserve">dd</w:t>
+      </w:r>
+      <w:r>
+        <w:t xml:space="preserve"> </w:t>
+      </w:r>
+      <w:r>
+        <w:t xml:space="preserve">finishes when it has written 18 GB.</w:t>
+      </w:r>
+      <w:r>
+        <w:t xml:space="preserve"> </w:t>
+      </w:r>
+      <w:r>
+        <w:rPr>
+          <w:rStyle w:val="VerbatimChar"/>
+        </w:rPr>
+        <w:t xml:space="preserve">chmod</w:t>
+      </w:r>
+      <w:r>
+        <w:t xml:space="preserve"> </w:t>
+      </w:r>
+      <w:r>
+        <w:t xml:space="preserve">prints nothing.</w:t>
+      </w:r>
+    </w:p>
+    <w:p>
+      <w:pPr>
+        <w:pStyle w:val="BodyText"/>
+      </w:pPr>
+      <w:r>
+        <w:rPr>
+          <w:b/>
+        </w:rPr>
+        <w:t xml:space="preserve">Expected output:</w:t>
+      </w:r>
+    </w:p>
+    <w:p>
+      <w:pPr>
+        <w:pStyle w:val="BodyText"/>
+      </w:pPr>
+      <w:r>
+        <w:rPr>
+          <w:rStyle w:val="VerbatimChar"/>
+        </w:rPr>
+        <w:t xml:space="preserve">mkswap</w:t>
+      </w:r>
+      <w:r>
+        <w:t xml:space="preserve"> </w:t>
+      </w:r>
+      <w:r>
+        <w:t xml:space="preserve">includes:</w:t>
+      </w:r>
+    </w:p>
+    <w:p>
+      <w:pPr>
+        <w:pStyle w:val="SourceCode"/>
+        <w:spacing w:before="120" w:after="120" w:line="276" w:lineRule="auto"/>
+      </w:pPr>
+      <w:r>
+        <w:rPr>
+          <w:rStyle w:val="VerbatimChar"/>
+        </w:rPr>
+        <w:t xml:space="preserve">Setting up swapspace version 1, size = 18 GiB</w:t>
+      </w:r>
+    </w:p>
+    <w:p>
+      <w:pPr>
+        <w:pStyle w:val="FirstParagraph"/>
+      </w:pPr>
+      <w:r>
+        <w:rPr>
+          <w:rStyle w:val="VerbatimChar"/>
+        </w:rPr>
+        <w:t xml:space="preserve">swapon</w:t>
+      </w:r>
+      <w:r>
+        <w:t xml:space="preserve"> </w:t>
+      </w:r>
+      <w:r>
+        <w:t xml:space="preserve">prints nothing.</w:t>
+      </w:r>
+    </w:p>
+    <w:p>
+      <w:pPr>
+        <w:pStyle w:val="BodyText"/>
+      </w:pPr>
+      <w:r>
+        <w:rPr>
+          <w:b/>
+        </w:rPr>
+        <w:t xml:space="preserve">Confirm by running:</w:t>
+      </w:r>
+    </w:p>
+    <w:p>
+      <w:pPr>
+        <w:pStyle w:val="SourceCode"/>
+        <w:spacing w:before="120" w:after="120" w:line="276" w:lineRule="auto"/>
+      </w:pPr>
+      <w:r>
+        <w:rPr>
           <w:rStyle w:val="VariableTok"/>
         </w:rPr>
         <w:t xml:space="preserve">OPT_UUID=$(</w:t>
@@ -3741,6 +4222,198 @@
       </w:r>
       <w:r>
         <w:rPr>
+          <w:rStyle w:val="BuiltInTok"/>
+        </w:rPr>
+        <w:t xml:space="preserve">printf</w:t>
+      </w:r>
+      <w:r>
+        <w:rPr>
+          <w:rStyle w:val="NormalTok"/>
+        </w:rPr>
+        <w:t xml:space="preserve"> </w:t>
+      </w:r>
+      <w:r>
+        <w:rPr>
+          <w:rStyle w:val="StringTok"/>
+        </w:rPr>
+        <w:t xml:space="preserve">'%s\n'</w:t>
+      </w:r>
+      <w:r>
+        <w:rPr>
+          <w:rStyle w:val="NormalTok"/>
+        </w:rPr>
+        <w:t xml:space="preserve"> </w:t>
+      </w:r>
+      <w:r>
+        <w:rPr>
+          <w:rStyle w:val="StringTok"/>
+        </w:rPr>
+        <w:t xml:space="preserve">"</w:t>
+      </w:r>
+      <w:r>
+        <w:rPr>
+          <w:rStyle w:val="VariableTok"/>
+        </w:rPr>
+        <w:t xml:space="preserve">$OPT_UUID</w:t>
+      </w:r>
+      <w:r>
+        <w:rPr>
+          <w:rStyle w:val="StringTok"/>
+        </w:rPr>
+        <w:t xml:space="preserve">"</w:t>
+      </w:r>
+    </w:p>
+    <w:p>
+      <w:pPr>
+        <w:pStyle w:val="FirstParagraph"/>
+      </w:pPr>
+      <w:r>
+        <w:rPr>
+          <w:b/>
+        </w:rPr>
+        <w:t xml:space="preserve">Expected output:</w:t>
+      </w:r>
+    </w:p>
+    <w:p>
+      <w:pPr>
+        <w:pStyle w:val="BodyText"/>
+      </w:pPr>
+      <w:r>
+        <w:t xml:space="preserve">One line, a UUID with hyphens.</w:t>
+      </w:r>
+      <w:r>
+        <w:t xml:space="preserve"> </w:t>
+      </w:r>
+      <w:r>
+        <w:rPr>
+          <w:rStyle w:val="VerbatimChar"/>
+        </w:rPr>
+        <w:t xml:space="preserve">blkid: error:</w:t>
+      </w:r>
+      <w:r>
+        <w:t xml:space="preserve"> </w:t>
+      </w:r>
+      <w:r>
+        <w:t xml:space="preserve">or an empty line means</w:t>
+      </w:r>
+      <w:r>
+        <w:t xml:space="preserve"> </w:t>
+      </w:r>
+      <w:r>
+        <w:rPr>
+          <w:rStyle w:val="VerbatimChar"/>
+        </w:rPr>
+        <w:t xml:space="preserve">/dev/datavg/optlv</w:t>
+      </w:r>
+      <w:r>
+        <w:t xml:space="preserve"> </w:t>
+      </w:r>
+      <w:r>
+        <w:t xml:space="preserve">does not exist. Stop. Leave</w:t>
+      </w:r>
+      <w:r>
+        <w:t xml:space="preserve"> </w:t>
+      </w:r>
+      <w:r>
+        <w:rPr>
+          <w:rStyle w:val="VerbatimChar"/>
+        </w:rPr>
+        <w:t xml:space="preserve">/etc/fstab</w:t>
+      </w:r>
+      <w:r>
+        <w:t xml:space="preserve"> </w:t>
+      </w:r>
+      <w:r>
+        <w:t xml:space="preserve">unchanged and return to section 3.</w:t>
+      </w:r>
+    </w:p>
+    <w:p>
+      <w:pPr>
+        <w:pStyle w:val="BodyText"/>
+      </w:pPr>
+      <w:r>
+        <w:t xml:space="preserve">Write</w:t>
+      </w:r>
+      <w:r>
+        <w:t xml:space="preserve"> </w:t>
+      </w:r>
+      <w:r>
+        <w:rPr>
+          <w:rStyle w:val="VerbatimChar"/>
+        </w:rPr>
+        <w:t xml:space="preserve">/etc/fstab</w:t>
+      </w:r>
+      <w:r>
+        <w:t xml:space="preserve"> </w:t>
+      </w:r>
+      <w:r>
+        <w:t xml:space="preserve">with that UUID.</w:t>
+      </w:r>
+      <w:r>
+        <w:t xml:space="preserve"> </w:t>
+      </w:r>
+      <w:r>
+        <w:rPr>
+          <w:rStyle w:val="VerbatimChar"/>
+        </w:rPr>
+        <w:t xml:space="preserve">nofail</w:t>
+      </w:r>
+      <w:r>
+        <w:t xml:space="preserve"> </w:t>
+      </w:r>
+      <w:r>
+        <w:t xml:space="preserve">lets the VM boot when the data disk is absent. The checks in the next section catch a missing mount before the install. Append these lines only after the UUID check printed a value. An empty</w:t>
+      </w:r>
+      <w:r>
+        <w:t xml:space="preserve"> </w:t>
+      </w:r>
+      <w:r>
+        <w:rPr>
+          <w:rStyle w:val="VerbatimChar"/>
+        </w:rPr>
+        <w:t xml:space="preserve">UUID=</w:t>
+      </w:r>
+      <w:r>
+        <w:t xml:space="preserve"> </w:t>
+      </w:r>
+      <w:r>
+        <w:t xml:space="preserve">line is skipped by</w:t>
+      </w:r>
+      <w:r>
+        <w:t xml:space="preserve"> </w:t>
+      </w:r>
+      <w:r>
+        <w:rPr>
+          <w:rStyle w:val="VerbatimChar"/>
+        </w:rPr>
+        <w:t xml:space="preserve">mount -a</w:t>
+      </w:r>
+      <w:r>
+        <w:t xml:space="preserve"> </w:t>
+      </w:r>
+      <w:r>
+        <w:t xml:space="preserve">because of</w:t>
+      </w:r>
+      <w:r>
+        <w:t xml:space="preserve"> </w:t>
+      </w:r>
+      <w:r>
+        <w:rPr>
+          <w:rStyle w:val="VerbatimChar"/>
+        </w:rPr>
+        <w:t xml:space="preserve">nofail</w:t>
+      </w:r>
+      <w:r>
+        <w:t xml:space="preserve">, and that command still prints nothing.</w:t>
+      </w:r>
+    </w:p>
+    <w:p>
+      <w:pPr>
+        <w:pStyle w:val="SourceCode"/>
+        <w:spacing w:before="120" w:after="120" w:line="276" w:lineRule="auto"/>
+      </w:pPr>
+      <w:r>
+        <w:rPr>
           <w:rStyle w:val="FunctionTok"/>
         </w:rPr>
         <w:t xml:space="preserve">cat</w:t>
@@ -3849,18 +4522,6 @@
       <w:pPr>
         <w:pStyle w:val="FirstParagraph"/>
       </w:pPr>
-      <w:r>
-        <w:rPr>
-          <w:rStyle w:val="VerbatimChar"/>
-        </w:rPr>
-        <w:t xml:space="preserve">blkid</w:t>
-      </w:r>
-      <w:r>
-        <w:t xml:space="preserve">,</w:t>
-      </w:r>
-      <w:r>
-        <w:t xml:space="preserve"> </w:t>
-      </w:r>
       <w:r>
         <w:rPr>
           <w:rStyle w:val="VerbatimChar"/>
@@ -4940,7 +5601,7 @@
     </w:lvl>
   </w:abstractNum>
   <w:abstractNum w:abstractNumId="990">
-    <w:nsid w:val="690d1e3e"/>
+    <w:nsid w:val="a398445b"/>
     <w:multiLevelType w:val="multilevel"/>
     <w:lvl w:ilvl="0">
       <w:numFmt w:val="bullet"/>

</xml_diff>

<commit_message>
Record the 1 TB mount output from TNMSDEMO.
findmnt prints 1023.5G for datavg-optlv, and df shows 1.0T with 7.2G used and 1017G free. The sample line is output, not a command.
</commit_message>
<xml_diff>
--- a/docs/customer/TNMS-9.1-RHEL8-pre-install.docx
+++ b/docs/customer/TNMS-9.1-RHEL8-pre-install.docx
@@ -3469,19 +3469,22 @@
         <w:t xml:space="preserve"> </w:t>
       </w:r>
       <w:r>
-        <w:t xml:space="preserve">is about</w:t>
-      </w:r>
-      <w:r>
-        <w:t xml:space="preserve"> </w:t>
-      </w:r>
-      <w:r>
-        <w:rPr>
-          <w:rStyle w:val="VerbatimChar"/>
-        </w:rPr>
-        <w:t xml:space="preserve">1T</w:t>
-      </w:r>
-      <w:r>
-        <w:t xml:space="preserve">.</w:t>
+        <w:t xml:space="preserve">is</w:t>
+      </w:r>
+      <w:r>
+        <w:t xml:space="preserve"> </w:t>
+      </w:r>
+      <w:r>
+        <w:rPr>
+          <w:rStyle w:val="VerbatimChar"/>
+        </w:rPr>
+        <w:t xml:space="preserve">1023.5G</w:t>
+      </w:r>
+      <w:r>
+        <w:t xml:space="preserve"> </w:t>
+      </w:r>
+      <w:r>
+        <w:t xml:space="preserve">on this image. That is the 1 TB disk.</w:t>
       </w:r>
     </w:p>
     <w:p>
@@ -3493,7 +3496,7 @@
         <w:rPr>
           <w:rStyle w:val="VerbatimChar"/>
         </w:rPr>
-        <w:t xml:space="preserve">/dev/mapper/datavg-optlv  1T   /opt</w:t>
+        <w:t xml:space="preserve">/dev/mapper/datavg-optlv 1023.5G /opt</w:t>
       </w:r>
     </w:p>
     <w:p>
@@ -3972,7 +3975,7 @@
         <w:rPr>
           <w:rStyle w:val="VerbatimChar"/>
         </w:rPr>
-        <w:t xml:space="preserve">/dev/mapper/datavg-optlv  1T   /opt</w:t>
+        <w:t xml:space="preserve">/dev/mapper/datavg-optlv 1023.5G /opt</w:t>
       </w:r>
       <w:r>
         <w:br w:type="textWrapping"/>
@@ -3981,7 +3984,7 @@
         <w:rPr>
           <w:rStyle w:val="VerbatimChar"/>
         </w:rPr>
-        <w:t xml:space="preserve">Filesystem                    Size  Used Avail Use% Mounted on</w:t>
+        <w:t xml:space="preserve">Filesystem                Size  Used Avail Use% Mounted on</w:t>
       </w:r>
       <w:r>
         <w:br w:type="textWrapping"/>
@@ -3990,7 +3993,7 @@
         <w:rPr>
           <w:rStyle w:val="VerbatimChar"/>
         </w:rPr>
-        <w:t xml:space="preserve">/dev/mapper/datavg-optlv      1.0T   10G  1.0T   1% /opt</w:t>
+        <w:t xml:space="preserve">/dev/mapper/datavg-optlv  1.0T  7.2G 1017G   1% /opt</w:t>
       </w:r>
     </w:p>
     <w:p>
@@ -4007,7 +4010,7 @@
         <w:t xml:space="preserve"> </w:t>
       </w:r>
       <w:r>
-        <w:t xml:space="preserve">follows the disk.</w:t>
+        <w:t xml:space="preserve">on a fresh filesystem is about 7.2G.</w:t>
       </w:r>
       <w:r>
         <w:t xml:space="preserve"> </w:t>
@@ -4022,7 +4025,7 @@
         <w:t xml:space="preserve"> </w:t>
       </w:r>
       <w:r>
-        <w:t xml:space="preserve">stays above 20G.</w:t>
+        <w:t xml:space="preserve">stays above 20G. The text block above is an example of the output. It is not a command.</w:t>
       </w:r>
     </w:p>
     <w:p>
@@ -5601,7 +5604,7 @@
     </w:lvl>
   </w:abstractNum>
   <w:abstractNum w:abstractNumId="990">
-    <w:nsid w:val="a398445b"/>
+    <w:nsid w:val="4f6ab291"/>
     <w:multiLevelType w:val="multilevel"/>
     <w:lvl w:ilvl="0">
       <w:numFmt w:val="bullet"/>

</xml_diff>

<commit_message>
Replace the media list with the file move and permissions.
Confirm the install files checks /tmp and /opt, moves the five files into place, and sets mode 750, 740, and 640 for the SSH login. The old media catalog is gone.
</commit_message>
<xml_diff>
--- a/docs/customer/TNMS-9.1-RHEL8-pre-install.docx
+++ b/docs/customer/TNMS-9.1-RHEL8-pre-install.docx
@@ -5922,7 +5922,22 @@
         <w:t xml:space="preserve">/tmp</w:t>
       </w:r>
       <w:r>
-        <w:t xml:space="preserve">. After the disk checks, that guide moves them into</w:t>
+        <w:t xml:space="preserve">.</w:t>
+      </w:r>
+      <w:r>
+        <w:t xml:space="preserve"> </w:t>
+      </w:r>
+      <w:r>
+        <w:rPr>
+          <w:b/>
+        </w:rPr>
+        <w:t xml:space="preserve">Confirm the install files</w:t>
+      </w:r>
+      <w:r>
+        <w:t xml:space="preserve"> </w:t>
+      </w:r>
+      <w:r>
+        <w:t xml:space="preserve">in that guide moves them into</w:t>
       </w:r>
       <w:r>
         <w:t xml:space="preserve"> </w:t>
@@ -5934,7 +5949,10 @@
         <w:t xml:space="preserve">/opt/tnms-install</w:t>
       </w:r>
       <w:r>
-        <w:t xml:space="preserve">. The properties file stays beside the script. The unpacked prerequisites and</w:t>
+        <w:t xml:space="preserve"> </w:t>
+      </w:r>
+      <w:r>
+        <w:t xml:space="preserve">and sets the permissions. The properties file stays beside the script. The unpacked prerequisites and</w:t>
       </w:r>
       <w:r>
         <w:t xml:space="preserve"> </w:t>
@@ -6198,7 +6216,7 @@
     </w:lvl>
   </w:abstractNum>
   <w:abstractNum w:abstractNumId="990">
-    <w:nsid w:val="9baf242c"/>
+    <w:nsid w:val="8bc786d9"/>
     <w:multiLevelType w:val="multilevel"/>
     <w:lvl w:ilvl="0">
       <w:numFmt w:val="bullet"/>

</xml_diff>

<commit_message>
Check the mounted layout and leave disk provisioning to the customer.
</commit_message>
<xml_diff>
--- a/docs/customer/TNMS-9.1-RHEL8-pre-install.docx
+++ b/docs/customer/TNMS-9.1-RHEL8-pre-install.docx
@@ -8680,31 +8680,22 @@
         <w:pStyle w:val="FirstParagraph"/>
       </w:pPr>
       <w:r>
-        <w:rPr>
-          <w:rStyle w:val="VerbatimChar"/>
-        </w:rPr>
-        <w:t xml:space="preserve">make scan</w:t>
-      </w:r>
-      <w:r>
-        <w:t xml:space="preserve"> </w:t>
-      </w:r>
-      <w:r>
-        <w:t xml:space="preserve">reads the host and asks before it changes a disk.</w:t>
-      </w:r>
-      <w:r>
-        <w:t xml:space="preserve"> </w:t>
-      </w:r>
-      <w:r>
-        <w:rPr>
-          <w:rStyle w:val="VerbatimChar"/>
-        </w:rPr>
-        <w:t xml:space="preserve">make prepare</w:t>
-      </w:r>
-      <w:r>
-        <w:t xml:space="preserve"> </w:t>
-      </w:r>
-      <w:r>
-        <w:t xml:space="preserve">applies sections 2 through 4 of this page. Section 6 stays manual.</w:t>
+        <w:t xml:space="preserve">Sections 2 through 4 of this page are the disk layout.</w:t>
+      </w:r>
+      <w:r>
+        <w:t xml:space="preserve"> </w:t>
+      </w:r>
+      <w:r>
+        <w:rPr>
+          <w:rStyle w:val="VerbatimChar"/>
+        </w:rPr>
+        <w:t xml:space="preserve">make</w:t>
+      </w:r>
+      <w:r>
+        <w:t xml:space="preserve"> </w:t>
+      </w:r>
+      <w:r>
+        <w:t xml:space="preserve">checks that layout and installs the product. Section 6 stays manual.</w:t>
       </w:r>
     </w:p>
     <w:p>
@@ -8802,84 +8793,6 @@
           <w:rStyle w:val="NormalTok"/>
         </w:rPr>
         <w:t xml:space="preserve"> install make</w:t>
-      </w:r>
-      <w:r>
-        <w:br/>
-      </w:r>
-      <w:r>
-        <w:rPr>
-          <w:rStyle w:val="FunctionTok"/>
-        </w:rPr>
-        <w:t xml:space="preserve">make</w:t>
-      </w:r>
-      <w:r>
-        <w:rPr>
-          <w:rStyle w:val="NormalTok"/>
-        </w:rPr>
-        <w:t xml:space="preserve"> </w:t>
-      </w:r>
-      <w:r>
-        <w:rPr>
-          <w:rStyle w:val="AttributeTok"/>
-        </w:rPr>
-        <w:t xml:space="preserve">-C</w:t>
-      </w:r>
-      <w:r>
-        <w:rPr>
-          <w:rStyle w:val="NormalTok"/>
-        </w:rPr>
-        <w:t xml:space="preserve"> /tmp </w:t>
-      </w:r>
-      <w:r>
-        <w:rPr>
-          <w:rStyle w:val="AttributeTok"/>
-        </w:rPr>
-        <w:t xml:space="preserve">-f</w:t>
-      </w:r>
-      <w:r>
-        <w:rPr>
-          <w:rStyle w:val="NormalTok"/>
-        </w:rPr>
-        <w:t xml:space="preserve"> Makefile scan</w:t>
-      </w:r>
-      <w:r>
-        <w:br/>
-      </w:r>
-      <w:r>
-        <w:rPr>
-          <w:rStyle w:val="FunctionTok"/>
-        </w:rPr>
-        <w:t xml:space="preserve">make</w:t>
-      </w:r>
-      <w:r>
-        <w:rPr>
-          <w:rStyle w:val="NormalTok"/>
-        </w:rPr>
-        <w:t xml:space="preserve"> </w:t>
-      </w:r>
-      <w:r>
-        <w:rPr>
-          <w:rStyle w:val="AttributeTok"/>
-        </w:rPr>
-        <w:t xml:space="preserve">-C</w:t>
-      </w:r>
-      <w:r>
-        <w:rPr>
-          <w:rStyle w:val="NormalTok"/>
-        </w:rPr>
-        <w:t xml:space="preserve"> /tmp </w:t>
-      </w:r>
-      <w:r>
-        <w:rPr>
-          <w:rStyle w:val="AttributeTok"/>
-        </w:rPr>
-        <w:t xml:space="preserve">-f</w:t>
-      </w:r>
-      <w:r>
-        <w:rPr>
-          <w:rStyle w:val="NormalTok"/>
-        </w:rPr>
-        <w:t xml:space="preserve"> Makefile prepare</w:t>
       </w:r>
       <w:r>
         <w:br/>

</xml_diff>